<commit_message>
- added car park rental agreement - updated other templates
</commit_message>
<xml_diff>
--- a/agreements/3. Room TA_AC.docx
+++ b/agreements/3. Room TA_AC.docx
@@ -558,6 +558,7 @@
                 <w:lang w:eastAsia="zh-CN"/>
               </w:rPr>
             </w:pPr>
+            <w:bookmarkStart w:id="50" w:name="NNF_50_4600_360_20_0_D"/>
             <w:r>
               <w:rPr>
                 <w:rFonts w:ascii="Cambria" w:eastAsia="DengXian" w:hAnsi="Cambria" w:cs="Cambria"/>
@@ -567,8 +568,9 @@
                 <w:szCs w:val="20"/>
                 <w:lang w:eastAsia="zh-CN"/>
               </w:rPr>
-              <w:t>Rental</w:t>
+              <w:t>{{rental_label}}</w:t>
             </w:r>
+            <w:bookmarkEnd w:id="50"/>
           </w:p>
         </w:tc>
         <w:tc>

</xml_diff>